<commit_message>
wip(auto): 2026-10-21 04:03 - layout (10)
WIP-Auto: wip-sweep v1
</commit_message>
<xml_diff>
--- a/layout/docx/01-the-misdirection.docx
+++ b/layout/docx/01-the-misdirection.docx
@@ -61,13 +61,19 @@
         <w:t xml:space="preserve"> </w:t>
       </w:r>
       <w:r>
-        <w:t xml:space="preserve">folder did not contain was anything about the four</w:t>
-      </w:r>
-      <w:r>
-        <w:t xml:space="preserve"> </w:t>
-      </w:r>
-      <w:r>
-        <w:t xml:space="preserve">seconds where the mouth did not match the new line.</w:t>
+        <w:t xml:space="preserve">folder did not contain was anything about the four seconds where a regenerated</w:t>
+      </w:r>
+      <w:r>
+        <w:t xml:space="preserve"> </w:t>
+      </w:r>
+      <w:r>
+        <w:t xml:space="preserve">mouth, built for a translated line, had to be made to look like it belonged to</w:t>
+      </w:r>
+      <w:r>
+        <w:t xml:space="preserve"> </w:t>
+      </w:r>
+      <w:r>
+        <w:t xml:space="preserve">the performance.</w:t>
       </w:r>
     </w:p>
     <w:p>
@@ -93,13 +99,19 @@
         <w:t xml:space="preserve"> </w:t>
       </w:r>
       <w:r>
-        <w:t xml:space="preserve">down — the part that used to have a job title — the part where a person</w:t>
-      </w:r>
-      <w:r>
-        <w:t xml:space="preserve"> </w:t>
-      </w:r>
-      <w:r>
-        <w:t xml:space="preserve">decides whether the mouth is doing grief or a dub.</w:t>
+        <w:t xml:space="preserve">down — the part that used to have a job title, performance direction — the part</w:t>
+      </w:r>
+      <w:r>
+        <w:t xml:space="preserve"> </w:t>
+      </w:r>
+      <w:r>
+        <w:t xml:space="preserve">where a person decides whether the new mouth is doing grief or a dub, and</w:t>
+      </w:r>
+      <w:r>
+        <w:t xml:space="preserve"> </w:t>
+      </w:r>
+      <w:r>
+        <w:t xml:space="preserve">whether the face still belongs to the actor whose name is on the release.</w:t>
       </w:r>
     </w:p>
     <w:p>
@@ -113,13 +125,19 @@
         <w:t xml:space="preserve"> </w:t>
       </w:r>
       <w:r>
-        <w:t xml:space="preserve">name in the budget: not the take, not the frame, not the cut. He decided what</w:t>
-      </w:r>
-      <w:r>
-        <w:t xml:space="preserve"> </w:t>
-      </w:r>
-      <w:r>
-        <w:t xml:space="preserve">the face was doing while it said the line.</w:t>
+        <w:t xml:space="preserve">name in the budget: not the take, not the frame, not the cut. He decided the</w:t>
+      </w:r>
+      <w:r>
+        <w:t xml:space="preserve"> </w:t>
+      </w:r>
+      <w:r>
+        <w:t xml:space="preserve">performance — what the face was doing while it said the line — from a row of</w:t>
+      </w:r>
+      <w:r>
+        <w:t xml:space="preserve"> </w:t>
+      </w:r>
+      <w:r>
+        <w:t xml:space="preserve">machine candidates.</w:t>
       </w:r>
     </w:p>
     <w:p>

</xml_diff>